<commit_message>
Up toàn bộ bài tập lên git
</commit_message>
<xml_diff>
--- a/BTQT2_23520260/BTQT2_23520260.docx
+++ b/BTQT2_23520260/BTQT2_23520260.docx
@@ -44,9 +44,43 @@
     <w:p>
       <w:pPr>
         <w:jc w:val="center"/>
+        <w:rPr>
+          <w:lang w:val="vi-VN"/>
+        </w:rPr>
       </w:pPr>
       <w:r>
         <w:t>Sinh viên: Nguyễn Quốc Đạt – MSSV: 23520260</w:t>
+      </w:r>
+    </w:p>
+    <w:p>
+      <w:pPr>
+        <w:jc w:val="center"/>
+        <w:rPr>
+          <w:b/>
+          <w:bCs/>
+          <w:lang w:val="vi-VN"/>
+        </w:rPr>
+      </w:pPr>
+      <w:r>
+        <w:rPr>
+          <w:lang w:val="vi-VN"/>
+        </w:rPr>
+        <w:t xml:space="preserve">Link github: </w:t>
+      </w:r>
+      <w:hyperlink r:id="rId4" w:history="1">
+        <w:r>
+          <w:rPr>
+            <w:rStyle w:val="Hyperlink"/>
+            <w:lang w:val="vi-VN"/>
+          </w:rPr>
+          <w:t>https://github.com/danielnguyen0705/ie303_thuchanh/tree/BTQT/BTQT2_23520260</w:t>
+        </w:r>
+      </w:hyperlink>
+      <w:r>
+        <w:rPr>
+          <w:lang w:val="vi-VN"/>
+        </w:rPr>
+        <w:t xml:space="preserve"> </w:t>
       </w:r>
     </w:p>
     <w:p>
@@ -56,6 +90,9 @@
     </w:p>
     <w:p>
       <w:r>
+        <w:rPr>
+          <w:noProof/>
+        </w:rPr>
         <w:drawing>
           <wp:inline distT="0" distB="0" distL="0" distR="0" wp14:anchorId="02C1AF2D" wp14:editId="13F5F309">
             <wp:extent cx="5943600" cy="1207135"/>
@@ -72,7 +109,7 @@
                     <pic:cNvPicPr/>
                   </pic:nvPicPr>
                   <pic:blipFill>
-                    <a:blip r:embed="rId4"/>
+                    <a:blip r:embed="rId5"/>
                     <a:stretch>
                       <a:fillRect/>
                     </a:stretch>
@@ -98,23 +135,13 @@
         <w:t>Bài 2:</w:t>
       </w:r>
     </w:p>
-    <w:p/>
-    <w:p/>
     <w:p>
       <w:r>
-        <w:t>Bài 3:</w:t>
-      </w:r>
-    </w:p>
-    <w:p>
-      <w:r>
-        <w:rPr>
-          <w:noProof/>
-        </w:rPr>
         <w:drawing>
-          <wp:inline distT="0" distB="0" distL="0" distR="0" wp14:anchorId="416D41C1" wp14:editId="56772282">
-            <wp:extent cx="5943600" cy="2341880"/>
-            <wp:effectExtent l="0" t="0" r="0" b="1270"/>
-            <wp:docPr id="1671993697" name="Picture 1"/>
+          <wp:inline distT="0" distB="0" distL="0" distR="0" wp14:anchorId="42431A64" wp14:editId="64B759B0">
+            <wp:extent cx="5943600" cy="2537460"/>
+            <wp:effectExtent l="0" t="0" r="0" b="0"/>
+            <wp:docPr id="784578920" name="Picture 1"/>
             <wp:cNvGraphicFramePr>
               <a:graphicFrameLocks xmlns:a="http://schemas.openxmlformats.org/drawingml/2006/main" noChangeAspect="1"/>
             </wp:cNvGraphicFramePr>
@@ -122,11 +149,11 @@
               <a:graphicData uri="http://schemas.openxmlformats.org/drawingml/2006/picture">
                 <pic:pic xmlns:pic="http://schemas.openxmlformats.org/drawingml/2006/picture">
                   <pic:nvPicPr>
-                    <pic:cNvPr id="1671993697" name=""/>
+                    <pic:cNvPr id="784578920" name=""/>
                     <pic:cNvPicPr/>
                   </pic:nvPicPr>
                   <pic:blipFill>
-                    <a:blip r:embed="rId5"/>
+                    <a:blip r:embed="rId6"/>
                     <a:stretch>
                       <a:fillRect/>
                     </a:stretch>
@@ -134,7 +161,7 @@
                   <pic:spPr>
                     <a:xfrm>
                       <a:off x="0" y="0"/>
-                      <a:ext cx="5943600" cy="2341880"/>
+                      <a:ext cx="5943600" cy="2537460"/>
                     </a:xfrm>
                     <a:prstGeom prst="rect">
                       <a:avLst/>
@@ -147,22 +174,18 @@
         </w:drawing>
       </w:r>
     </w:p>
-    <w:p/>
     <w:p>
       <w:r>
-        <w:t>Bài 4:</w:t>
+        <w:t>Bài 3:</w:t>
       </w:r>
     </w:p>
     <w:p>
       <w:r>
-        <w:rPr>
-          <w:noProof/>
-        </w:rPr>
         <w:drawing>
-          <wp:inline distT="0" distB="0" distL="0" distR="0" wp14:anchorId="00188AF4" wp14:editId="13D3BB90">
-            <wp:extent cx="5943600" cy="1675765"/>
-            <wp:effectExtent l="0" t="0" r="0" b="635"/>
-            <wp:docPr id="1446339370" name="Picture 1"/>
+          <wp:inline distT="0" distB="0" distL="0" distR="0" wp14:anchorId="2070F32A" wp14:editId="490BEAE3">
+            <wp:extent cx="5943600" cy="2757170"/>
+            <wp:effectExtent l="0" t="0" r="0" b="5080"/>
+            <wp:docPr id="1874130234" name="Picture 1"/>
             <wp:cNvGraphicFramePr>
               <a:graphicFrameLocks xmlns:a="http://schemas.openxmlformats.org/drawingml/2006/main" noChangeAspect="1"/>
             </wp:cNvGraphicFramePr>
@@ -170,11 +193,11 @@
               <a:graphicData uri="http://schemas.openxmlformats.org/drawingml/2006/picture">
                 <pic:pic xmlns:pic="http://schemas.openxmlformats.org/drawingml/2006/picture">
                   <pic:nvPicPr>
-                    <pic:cNvPr id="1446339370" name=""/>
+                    <pic:cNvPr id="1874130234" name=""/>
                     <pic:cNvPicPr/>
                   </pic:nvPicPr>
                   <pic:blipFill>
-                    <a:blip r:embed="rId6"/>
+                    <a:blip r:embed="rId7"/>
                     <a:stretch>
                       <a:fillRect/>
                     </a:stretch>
@@ -182,7 +205,117 @@
                   <pic:spPr>
                     <a:xfrm>
                       <a:off x="0" y="0"/>
-                      <a:ext cx="5943600" cy="1675765"/>
+                      <a:ext cx="5943600" cy="2757170"/>
+                    </a:xfrm>
+                    <a:prstGeom prst="rect">
+                      <a:avLst/>
+                    </a:prstGeom>
+                  </pic:spPr>
+                </pic:pic>
+              </a:graphicData>
+            </a:graphic>
+          </wp:inline>
+        </w:drawing>
+      </w:r>
+    </w:p>
+    <w:p>
+      <w:r>
+        <w:t>Bài 4:</w:t>
+      </w:r>
+    </w:p>
+    <w:p>
+      <w:pPr>
+        <w:rPr>
+          <w:lang w:val="vi-VN"/>
+        </w:rPr>
+      </w:pPr>
+      <w:r>
+        <w:lastRenderedPageBreak/>
+        <w:drawing>
+          <wp:inline distT="0" distB="0" distL="0" distR="0" wp14:anchorId="6B5D55E1" wp14:editId="08D874CF">
+            <wp:extent cx="5943600" cy="2128520"/>
+            <wp:effectExtent l="0" t="0" r="0" b="5080"/>
+            <wp:docPr id="1600317401" name="Picture 1"/>
+            <wp:cNvGraphicFramePr>
+              <a:graphicFrameLocks xmlns:a="http://schemas.openxmlformats.org/drawingml/2006/main" noChangeAspect="1"/>
+            </wp:cNvGraphicFramePr>
+            <a:graphic xmlns:a="http://schemas.openxmlformats.org/drawingml/2006/main">
+              <a:graphicData uri="http://schemas.openxmlformats.org/drawingml/2006/picture">
+                <pic:pic xmlns:pic="http://schemas.openxmlformats.org/drawingml/2006/picture">
+                  <pic:nvPicPr>
+                    <pic:cNvPr id="1600317401" name=""/>
+                    <pic:cNvPicPr/>
+                  </pic:nvPicPr>
+                  <pic:blipFill>
+                    <a:blip r:embed="rId8"/>
+                    <a:stretch>
+                      <a:fillRect/>
+                    </a:stretch>
+                  </pic:blipFill>
+                  <pic:spPr>
+                    <a:xfrm>
+                      <a:off x="0" y="0"/>
+                      <a:ext cx="5943600" cy="2128520"/>
+                    </a:xfrm>
+                    <a:prstGeom prst="rect">
+                      <a:avLst/>
+                    </a:prstGeom>
+                  </pic:spPr>
+                </pic:pic>
+              </a:graphicData>
+            </a:graphic>
+          </wp:inline>
+        </w:drawing>
+      </w:r>
+    </w:p>
+    <w:p>
+      <w:pPr>
+        <w:rPr>
+          <w:lang w:val="vi-VN"/>
+        </w:rPr>
+      </w:pPr>
+      <w:r>
+        <w:rPr>
+          <w:lang w:val="vi-VN"/>
+        </w:rPr>
+        <w:t>Bài 5:</w:t>
+      </w:r>
+    </w:p>
+    <w:p>
+      <w:pPr>
+        <w:rPr>
+          <w:lang w:val="vi-VN"/>
+        </w:rPr>
+      </w:pPr>
+      <w:r>
+        <w:rPr>
+          <w:lang w:val="vi-VN"/>
+        </w:rPr>
+        <w:drawing>
+          <wp:inline distT="0" distB="0" distL="0" distR="0" wp14:anchorId="1B32B084" wp14:editId="5DF360B8">
+            <wp:extent cx="5943600" cy="4902200"/>
+            <wp:effectExtent l="0" t="0" r="0" b="0"/>
+            <wp:docPr id="271062931" name="Picture 1"/>
+            <wp:cNvGraphicFramePr>
+              <a:graphicFrameLocks xmlns:a="http://schemas.openxmlformats.org/drawingml/2006/main" noChangeAspect="1"/>
+            </wp:cNvGraphicFramePr>
+            <a:graphic xmlns:a="http://schemas.openxmlformats.org/drawingml/2006/main">
+              <a:graphicData uri="http://schemas.openxmlformats.org/drawingml/2006/picture">
+                <pic:pic xmlns:pic="http://schemas.openxmlformats.org/drawingml/2006/picture">
+                  <pic:nvPicPr>
+                    <pic:cNvPr id="271062931" name=""/>
+                    <pic:cNvPicPr/>
+                  </pic:nvPicPr>
+                  <pic:blipFill>
+                    <a:blip r:embed="rId9"/>
+                    <a:stretch>
+                      <a:fillRect/>
+                    </a:stretch>
+                  </pic:blipFill>
+                  <pic:spPr>
+                    <a:xfrm>
+                      <a:off x="0" y="0"/>
+                      <a:ext cx="5943600" cy="4902200"/>
                     </a:xfrm>
                     <a:prstGeom prst="rect">
                       <a:avLst/>
@@ -1117,6 +1250,29 @@
       <w:spacing w:val="5"/>
     </w:rPr>
   </w:style>
+  <w:style w:type="character" w:styleId="Hyperlink">
+    <w:name w:val="Hyperlink"/>
+    <w:basedOn w:val="DefaultParagraphFont"/>
+    <w:uiPriority w:val="99"/>
+    <w:unhideWhenUsed/>
+    <w:rsid w:val="003D55D3"/>
+    <w:rPr>
+      <w:color w:val="467886" w:themeColor="hyperlink"/>
+      <w:u w:val="single"/>
+    </w:rPr>
+  </w:style>
+  <w:style w:type="character" w:styleId="UnresolvedMention">
+    <w:name w:val="Unresolved Mention"/>
+    <w:basedOn w:val="DefaultParagraphFont"/>
+    <w:uiPriority w:val="99"/>
+    <w:semiHidden/>
+    <w:unhideWhenUsed/>
+    <w:rsid w:val="003D55D3"/>
+    <w:rPr>
+      <w:color w:val="605E5C"/>
+      <w:shd w:val="clear" w:color="auto" w:fill="E1DFDD"/>
+    </w:rPr>
+  </w:style>
 </w:styles>
 </file>
 

</xml_diff>